<commit_message>
Document the data enrichment explicitly in both reports
Enrichment was described across the synthesis and dataset sections but never
named, and neither document recorded a scope point that should have been
written down: the brief asked to amalgamate the export with the Retail app's
existing synthesized data, and there was none - the repository was empty, so
the export became the seed instead.

Both documents now carry that note and a section setting out what enrichment
actually added: the article-master fields the scenarios need to reason with and
that the export does not carry, a before-and-after table of volume, and the
dimensions the export had nothing on at all.
</commit_message>
<xml_diff>
--- a/docs/SMart_Retail_AI_Project_Report.docx
+++ b/docs/SMart_Retail_AI_Project_Report.docx
@@ -385,7 +385,7 @@
                 <w:sz w:val="19"/>
                 <w:szCs w:val="19"/>
               </w:rPr>
-              <w:t xml:space="preserve">Technical project report, revision 1.0</w:t>
+              <w:t xml:space="preserve">Technical project report, revision 1.1</w:t>
             </w:r>
           </w:p>
         </w:tc>
@@ -621,6 +621,49 @@
           <w:szCs w:val="21"/>
         </w:rPr>
         <w:t xml:space="preserve">That gap between what the system thinks happened and what actually happened is the most interesting problem in the data, so we built the checkout integrity scenario around it and let the other five scenarios fill out the picture: hourly demand forecasting, replenishment, fresh food markdown, basket affinity, and personalised offers, plus cold chain monitoring on the chiller probes.</w:t>
+      </w:r>
+    </w:p>
+    <w:p>
+      <w:pPr>
+        <w:pStyle w:val="Heading2"/>
+        <w:spacing w:after="120" w:before="260"/>
+      </w:pPr>
+      <w:r>
+        <w:rPr>
+          <w:rFonts w:ascii="Calibri" w:cs="Calibri" w:eastAsia="Calibri" w:hAnsi="Calibri"/>
+          <w:b/>
+          <w:bCs/>
+          <w:color w:val="1F4E79"/>
+          <w:sz w:val="24"/>
+          <w:szCs w:val="24"/>
+        </w:rPr>
+        <w:t xml:space="preserve">A note on scope</w:t>
+      </w:r>
+    </w:p>
+    <w:p>
+      <w:pPr>
+        <w:spacing w:after="140" w:line="276"/>
+      </w:pPr>
+      <w:r>
+        <w:rPr>
+          <w:rFonts w:ascii="Calibri" w:cs="Calibri" w:eastAsia="Calibri" w:hAnsi="Calibri"/>
+          <w:sz w:val="21"/>
+          <w:szCs w:val="21"/>
+        </w:rPr>
+        <w:t xml:space="preserve">The brief asked us to amalgamate the SAP export with the existing synthesized data for the Retail app. That turned out not to be possible, and it is worth recording why: the repository was empty when we started - no commits at all, just a bare git directory - so there was no prior dataset to merge with. Nothing was found elsewhere either.</w:t>
+      </w:r>
+    </w:p>
+    <w:p>
+      <w:pPr>
+        <w:spacing w:after="140" w:line="276"/>
+      </w:pPr>
+      <w:r>
+        <w:rPr>
+          <w:rFonts w:ascii="Calibri" w:cs="Calibri" w:eastAsia="Calibri" w:hAnsi="Calibri"/>
+          <w:sz w:val="21"/>
+          <w:szCs w:val="21"/>
+        </w:rPr>
+        <w:t xml:space="preserve">We therefore treated the export as the seed and enriched outward from it, which meets the intent of the brief but is not literally what was asked. If a Retail app dataset does exist somewhere, the pipeline is built to take it: stage two consumes the canonical extract and could just as easily consume a second source alongside it. Section 3.5 sets out exactly what the enrichment added.</w:t>
       </w:r>
     </w:p>
     <w:p>
@@ -5870,6 +5913,738 @@
         </w:tc>
       </w:tr>
     </w:tbl>
+    <w:p>
+      <w:pPr>
+        <w:pStyle w:val="Heading2"/>
+        <w:spacing w:after="120" w:before="260"/>
+      </w:pPr>
+      <w:r>
+        <w:rPr>
+          <w:rFonts w:ascii="Calibri" w:cs="Calibri" w:eastAsia="Calibri" w:hAnsi="Calibri"/>
+          <w:b/>
+          <w:bCs/>
+          <w:color w:val="1F4E79"/>
+          <w:sz w:val="24"/>
+          <w:szCs w:val="24"/>
+        </w:rPr>
+        <w:t xml:space="preserve">3.5 What the enrichment actually added</w:t>
+      </w:r>
+    </w:p>
+    <w:p>
+      <w:pPr>
+        <w:spacing w:after="140" w:line="276"/>
+      </w:pPr>
+      <w:r>
+        <w:rPr>
+          <w:rFonts w:ascii="Calibri" w:cs="Calibri" w:eastAsia="Calibri" w:hAnsi="Calibri"/>
+          <w:sz w:val="21"/>
+          <w:szCs w:val="21"/>
+        </w:rPr>
+        <w:t xml:space="preserve">"Enrichment" is a word that can cover anything, so this section is specific about what came out of SAP and what was added around it.</w:t>
+      </w:r>
+    </w:p>
+    <w:p>
+      <w:pPr>
+        <w:pStyle w:val="Heading3"/>
+        <w:spacing w:after="100" w:before="200"/>
+      </w:pPr>
+      <w:r>
+        <w:rPr>
+          <w:rFonts w:ascii="Calibri" w:cs="Calibri" w:eastAsia="Calibri" w:hAnsi="Calibri"/>
+          <w:b/>
+          <w:bCs/>
+          <w:color w:val="2E2E2E"/>
+          <w:sz w:val="22"/>
+          <w:szCs w:val="22"/>
+        </w:rPr>
+        <w:t xml:space="preserve">Structural enrichment of the article master</w:t>
+      </w:r>
+    </w:p>
+    <w:p>
+      <w:pPr>
+        <w:spacing w:after="140" w:line="276"/>
+      </w:pPr>
+      <w:r>
+        <w:rPr>
+          <w:rFonts w:ascii="Calibri" w:cs="Calibri" w:eastAsia="Calibri" w:hAnsi="Calibri"/>
+          <w:sz w:val="21"/>
+          <w:szCs w:val="21"/>
+        </w:rPr>
+        <w:t xml:space="preserve">The export gives a sales report keyed by article: identifier, name, quantity sold, gross and net revenue, discounts and VAT. Useful for reporting, but none of it is what an AI scenario needs to reason with. The model adds, per article: unit cost, temperature zone, shelf life in days, ABC class, whether the line is RFID tagged, whether it is a deposit line, shelf capacity, reorder point, and a supplier. The 63 German article groups also gained English names, a category and a temperature zone.</w:t>
+      </w:r>
+    </w:p>
+    <w:p>
+      <w:pPr>
+        <w:spacing w:after="140" w:line="276"/>
+      </w:pPr>
+      <w:r>
+        <w:rPr>
+          <w:rFonts w:ascii="Calibri" w:cs="Calibri" w:eastAsia="Calibri" w:hAnsi="Calibri"/>
+          <w:sz w:val="21"/>
+          <w:szCs w:val="21"/>
+        </w:rPr>
+        <w:t xml:space="preserve">Without those fields none of the scenarios can run. Shelf life is what makes the markdown engine possible; the RFID flag is what lets the integrity engine distinguish a misread from an untaggable article; unit cost is what turns a quantity into a margin.</w:t>
+      </w:r>
+    </w:p>
+    <w:p>
+      <w:pPr>
+        <w:pStyle w:val="Heading3"/>
+        <w:spacing w:after="100" w:before="200"/>
+      </w:pPr>
+      <w:r>
+        <w:rPr>
+          <w:rFonts w:ascii="Calibri" w:cs="Calibri" w:eastAsia="Calibri" w:hAnsi="Calibri"/>
+          <w:b/>
+          <w:bCs/>
+          <w:color w:val="2E2E2E"/>
+          <w:sz w:val="22"/>
+          <w:szCs w:val="22"/>
+        </w:rPr>
+        <w:t xml:space="preserve">Volume</w:t>
+      </w:r>
+    </w:p>
+    <w:tbl>
+      <w:tblPr>
+        <w:tblW w:type="dxa" w:w="9020"/>
+        <w:tblBorders>
+          <w:top w:val="single" w:color="BFBFBF" w:sz="4"/>
+          <w:left w:val="single" w:color="BFBFBF" w:sz="4"/>
+          <w:bottom w:val="single" w:color="BFBFBF" w:sz="4"/>
+          <w:right w:val="single" w:color="BFBFBF" w:sz="4"/>
+          <w:insideH w:val="single" w:color="D9D9D9" w:sz="2"/>
+          <w:insideV w:val="single" w:color="D9D9D9" w:sz="2"/>
+        </w:tblBorders>
+      </w:tblPr>
+      <w:tblGrid>
+        <w:gridCol w:w="3067"/>
+        <w:gridCol w:w="2977"/>
+        <w:gridCol w:w="2976"/>
+      </w:tblGrid>
+      <w:tr>
+        <w:trPr>
+          <w:tblHeader/>
+        </w:trPr>
+        <w:tc>
+          <w:tcPr>
+            <w:tcW w:type="dxa" w:w="3067"/>
+            <w:shd w:fill="1F4E79" w:color="auto" w:val="clear"/>
+            <w:tcMar>
+              <w:top w:type="dxa" w:w="70"/>
+              <w:left w:type="dxa" w:w="110"/>
+              <w:bottom w:type="dxa" w:w="70"/>
+              <w:right w:type="dxa" w:w="110"/>
+            </w:tcMar>
+          </w:tcPr>
+          <w:p>
+            <w:pPr>
+              <w:spacing w:after="0" w:line="250"/>
+            </w:pPr>
+            <w:r>
+              <w:rPr>
+                <w:rFonts w:ascii="Calibri" w:cs="Calibri" w:eastAsia="Calibri" w:hAnsi="Calibri"/>
+                <w:b/>
+                <w:bCs/>
+                <w:color w:val="FFFFFF"/>
+                <w:sz w:val="19"/>
+                <w:szCs w:val="19"/>
+              </w:rPr>
+              <w:t xml:space="preserve">Dimension</w:t>
+            </w:r>
+          </w:p>
+        </w:tc>
+        <w:tc>
+          <w:tcPr>
+            <w:tcW w:type="dxa" w:w="2977"/>
+            <w:shd w:fill="1F4E79" w:color="auto" w:val="clear"/>
+            <w:tcMar>
+              <w:top w:type="dxa" w:w="70"/>
+              <w:left w:type="dxa" w:w="110"/>
+              <w:bottom w:type="dxa" w:w="70"/>
+              <w:right w:type="dxa" w:w="110"/>
+            </w:tcMar>
+          </w:tcPr>
+          <w:p>
+            <w:pPr>
+              <w:spacing w:after="0" w:line="250"/>
+              <w:jc w:val="right"/>
+            </w:pPr>
+            <w:r>
+              <w:rPr>
+                <w:rFonts w:ascii="Calibri" w:cs="Calibri" w:eastAsia="Calibri" w:hAnsi="Calibri"/>
+                <w:b/>
+                <w:bCs/>
+                <w:color w:val="FFFFFF"/>
+                <w:sz w:val="19"/>
+                <w:szCs w:val="19"/>
+              </w:rPr>
+              <w:t xml:space="preserve">From the SAP export</w:t>
+            </w:r>
+          </w:p>
+        </w:tc>
+        <w:tc>
+          <w:tcPr>
+            <w:tcW w:type="dxa" w:w="2976"/>
+            <w:shd w:fill="1F4E79" w:color="auto" w:val="clear"/>
+            <w:tcMar>
+              <w:top w:type="dxa" w:w="70"/>
+              <w:left w:type="dxa" w:w="110"/>
+              <w:bottom w:type="dxa" w:w="70"/>
+              <w:right w:type="dxa" w:w="110"/>
+            </w:tcMar>
+          </w:tcPr>
+          <w:p>
+            <w:pPr>
+              <w:spacing w:after="0" w:line="250"/>
+              <w:jc w:val="right"/>
+            </w:pPr>
+            <w:r>
+              <w:rPr>
+                <w:rFonts w:ascii="Calibri" w:cs="Calibri" w:eastAsia="Calibri" w:hAnsi="Calibri"/>
+                <w:b/>
+                <w:bCs/>
+                <w:color w:val="FFFFFF"/>
+                <w:sz w:val="19"/>
+                <w:szCs w:val="19"/>
+              </w:rPr>
+              <w:t xml:space="preserve">After enrichment</w:t>
+            </w:r>
+          </w:p>
+        </w:tc>
+      </w:tr>
+      <w:tr>
+        <w:tc>
+          <w:tcPr>
+            <w:tcW w:type="dxa" w:w="3067"/>
+            <w:tcMar>
+              <w:top w:type="dxa" w:w="70"/>
+              <w:left w:type="dxa" w:w="110"/>
+              <w:bottom w:type="dxa" w:w="70"/>
+              <w:right w:type="dxa" w:w="110"/>
+            </w:tcMar>
+          </w:tcPr>
+          <w:p>
+            <w:pPr>
+              <w:spacing w:after="0" w:line="250"/>
+            </w:pPr>
+            <w:r>
+              <w:rPr>
+                <w:rFonts w:ascii="Calibri" w:cs="Calibri" w:eastAsia="Calibri" w:hAnsi="Calibri"/>
+                <w:sz w:val="19"/>
+                <w:szCs w:val="19"/>
+              </w:rPr>
+              <w:t xml:space="preserve">Stores</w:t>
+            </w:r>
+          </w:p>
+        </w:tc>
+        <w:tc>
+          <w:tcPr>
+            <w:tcW w:type="dxa" w:w="2977"/>
+            <w:tcMar>
+              <w:top w:type="dxa" w:w="70"/>
+              <w:left w:type="dxa" w:w="110"/>
+              <w:bottom w:type="dxa" w:w="70"/>
+              <w:right w:type="dxa" w:w="110"/>
+            </w:tcMar>
+          </w:tcPr>
+          <w:p>
+            <w:pPr>
+              <w:spacing w:after="0" w:line="250"/>
+              <w:jc w:val="right"/>
+            </w:pPr>
+            <w:r>
+              <w:rPr>
+                <w:rFonts w:ascii="Calibri" w:cs="Calibri" w:eastAsia="Calibri" w:hAnsi="Calibri"/>
+                <w:sz w:val="19"/>
+                <w:szCs w:val="19"/>
+              </w:rPr>
+              <w:t xml:space="preserve">1</w:t>
+            </w:r>
+          </w:p>
+        </w:tc>
+        <w:tc>
+          <w:tcPr>
+            <w:tcW w:type="dxa" w:w="2976"/>
+            <w:tcMar>
+              <w:top w:type="dxa" w:w="70"/>
+              <w:left w:type="dxa" w:w="110"/>
+              <w:bottom w:type="dxa" w:w="70"/>
+              <w:right w:type="dxa" w:w="110"/>
+            </w:tcMar>
+          </w:tcPr>
+          <w:p>
+            <w:pPr>
+              <w:spacing w:after="0" w:line="250"/>
+              <w:jc w:val="right"/>
+            </w:pPr>
+            <w:r>
+              <w:rPr>
+                <w:rFonts w:ascii="Calibri" w:cs="Calibri" w:eastAsia="Calibri" w:hAnsi="Calibri"/>
+                <w:sz w:val="19"/>
+                <w:szCs w:val="19"/>
+              </w:rPr>
+              <w:t xml:space="preserve">6</w:t>
+            </w:r>
+          </w:p>
+        </w:tc>
+      </w:tr>
+      <w:tr>
+        <w:tc>
+          <w:tcPr>
+            <w:tcW w:type="dxa" w:w="3067"/>
+            <w:shd w:fill="F2F5F8" w:color="auto" w:val="clear"/>
+            <w:tcMar>
+              <w:top w:type="dxa" w:w="70"/>
+              <w:left w:type="dxa" w:w="110"/>
+              <w:bottom w:type="dxa" w:w="70"/>
+              <w:right w:type="dxa" w:w="110"/>
+            </w:tcMar>
+          </w:tcPr>
+          <w:p>
+            <w:pPr>
+              <w:spacing w:after="0" w:line="250"/>
+            </w:pPr>
+            <w:r>
+              <w:rPr>
+                <w:rFonts w:ascii="Calibri" w:cs="Calibri" w:eastAsia="Calibri" w:hAnsi="Calibri"/>
+                <w:sz w:val="19"/>
+                <w:szCs w:val="19"/>
+              </w:rPr>
+              <w:t xml:space="preserve">Terminals</w:t>
+            </w:r>
+          </w:p>
+        </w:tc>
+        <w:tc>
+          <w:tcPr>
+            <w:tcW w:type="dxa" w:w="2977"/>
+            <w:shd w:fill="F2F5F8" w:color="auto" w:val="clear"/>
+            <w:tcMar>
+              <w:top w:type="dxa" w:w="70"/>
+              <w:left w:type="dxa" w:w="110"/>
+              <w:bottom w:type="dxa" w:w="70"/>
+              <w:right w:type="dxa" w:w="110"/>
+            </w:tcMar>
+          </w:tcPr>
+          <w:p>
+            <w:pPr>
+              <w:spacing w:after="0" w:line="250"/>
+              <w:jc w:val="right"/>
+            </w:pPr>
+            <w:r>
+              <w:rPr>
+                <w:rFonts w:ascii="Calibri" w:cs="Calibri" w:eastAsia="Calibri" w:hAnsi="Calibri"/>
+                <w:sz w:val="19"/>
+                <w:szCs w:val="19"/>
+              </w:rPr>
+              <w:t xml:space="preserve">3</w:t>
+            </w:r>
+          </w:p>
+        </w:tc>
+        <w:tc>
+          <w:tcPr>
+            <w:tcW w:type="dxa" w:w="2976"/>
+            <w:shd w:fill="F2F5F8" w:color="auto" w:val="clear"/>
+            <w:tcMar>
+              <w:top w:type="dxa" w:w="70"/>
+              <w:left w:type="dxa" w:w="110"/>
+              <w:bottom w:type="dxa" w:w="70"/>
+              <w:right w:type="dxa" w:w="110"/>
+            </w:tcMar>
+          </w:tcPr>
+          <w:p>
+            <w:pPr>
+              <w:spacing w:after="0" w:line="250"/>
+              <w:jc w:val="right"/>
+            </w:pPr>
+            <w:r>
+              <w:rPr>
+                <w:rFonts w:ascii="Calibri" w:cs="Calibri" w:eastAsia="Calibri" w:hAnsi="Calibri"/>
+                <w:sz w:val="19"/>
+                <w:szCs w:val="19"/>
+              </w:rPr>
+              <w:t xml:space="preserve">17</w:t>
+            </w:r>
+          </w:p>
+        </w:tc>
+      </w:tr>
+      <w:tr>
+        <w:tc>
+          <w:tcPr>
+            <w:tcW w:type="dxa" w:w="3067"/>
+            <w:tcMar>
+              <w:top w:type="dxa" w:w="70"/>
+              <w:left w:type="dxa" w:w="110"/>
+              <w:bottom w:type="dxa" w:w="70"/>
+              <w:right w:type="dxa" w:w="110"/>
+            </w:tcMar>
+          </w:tcPr>
+          <w:p>
+            <w:pPr>
+              <w:spacing w:after="0" w:line="250"/>
+            </w:pPr>
+            <w:r>
+              <w:rPr>
+                <w:rFonts w:ascii="Calibri" w:cs="Calibri" w:eastAsia="Calibri" w:hAnsi="Calibri"/>
+                <w:sz w:val="19"/>
+                <w:szCs w:val="19"/>
+              </w:rPr>
+              <w:t xml:space="preserve">Hourly sales rows</w:t>
+            </w:r>
+          </w:p>
+        </w:tc>
+        <w:tc>
+          <w:tcPr>
+            <w:tcW w:type="dxa" w:w="2977"/>
+            <w:tcMar>
+              <w:top w:type="dxa" w:w="70"/>
+              <w:left w:type="dxa" w:w="110"/>
+              <w:bottom w:type="dxa" w:w="70"/>
+              <w:right w:type="dxa" w:w="110"/>
+            </w:tcMar>
+          </w:tcPr>
+          <w:p>
+            <w:pPr>
+              <w:spacing w:after="0" w:line="250"/>
+              <w:jc w:val="right"/>
+            </w:pPr>
+            <w:r>
+              <w:rPr>
+                <w:rFonts w:ascii="Calibri" w:cs="Calibri" w:eastAsia="Calibri" w:hAnsi="Calibri"/>
+                <w:sz w:val="19"/>
+                <w:szCs w:val="19"/>
+              </w:rPr>
+              <w:t xml:space="preserve">4,926</w:t>
+            </w:r>
+          </w:p>
+        </w:tc>
+        <w:tc>
+          <w:tcPr>
+            <w:tcW w:type="dxa" w:w="2976"/>
+            <w:tcMar>
+              <w:top w:type="dxa" w:w="70"/>
+              <w:left w:type="dxa" w:w="110"/>
+              <w:bottom w:type="dxa" w:w="70"/>
+              <w:right w:type="dxa" w:w="110"/>
+            </w:tcMar>
+          </w:tcPr>
+          <w:p>
+            <w:pPr>
+              <w:spacing w:after="0" w:line="250"/>
+              <w:jc w:val="right"/>
+            </w:pPr>
+            <w:r>
+              <w:rPr>
+                <w:rFonts w:ascii="Calibri" w:cs="Calibri" w:eastAsia="Calibri" w:hAnsi="Calibri"/>
+                <w:sz w:val="19"/>
+                <w:szCs w:val="19"/>
+              </w:rPr>
+              <w:t xml:space="preserve">27,118</w:t>
+            </w:r>
+          </w:p>
+        </w:tc>
+      </w:tr>
+      <w:tr>
+        <w:tc>
+          <w:tcPr>
+            <w:tcW w:type="dxa" w:w="3067"/>
+            <w:shd w:fill="F2F5F8" w:color="auto" w:val="clear"/>
+            <w:tcMar>
+              <w:top w:type="dxa" w:w="70"/>
+              <w:left w:type="dxa" w:w="110"/>
+              <w:bottom w:type="dxa" w:w="70"/>
+              <w:right w:type="dxa" w:w="110"/>
+            </w:tcMar>
+          </w:tcPr>
+          <w:p>
+            <w:pPr>
+              <w:spacing w:after="0" w:line="250"/>
+            </w:pPr>
+            <w:r>
+              <w:rPr>
+                <w:rFonts w:ascii="Calibri" w:cs="Calibri" w:eastAsia="Calibri" w:hAnsi="Calibri"/>
+                <w:sz w:val="19"/>
+                <w:szCs w:val="19"/>
+              </w:rPr>
+              <w:t xml:space="preserve">Receipts</w:t>
+            </w:r>
+          </w:p>
+        </w:tc>
+        <w:tc>
+          <w:tcPr>
+            <w:tcW w:type="dxa" w:w="2977"/>
+            <w:shd w:fill="F2F5F8" w:color="auto" w:val="clear"/>
+            <w:tcMar>
+              <w:top w:type="dxa" w:w="70"/>
+              <w:left w:type="dxa" w:w="110"/>
+              <w:bottom w:type="dxa" w:w="70"/>
+              <w:right w:type="dxa" w:w="110"/>
+            </w:tcMar>
+          </w:tcPr>
+          <w:p>
+            <w:pPr>
+              <w:spacing w:after="0" w:line="250"/>
+              <w:jc w:val="right"/>
+            </w:pPr>
+            <w:r>
+              <w:rPr>
+                <w:rFonts w:ascii="Calibri" w:cs="Calibri" w:eastAsia="Calibri" w:hAnsi="Calibri"/>
+                <w:sz w:val="19"/>
+                <w:szCs w:val="19"/>
+              </w:rPr>
+              <w:t xml:space="preserve">2,550 (totals only)</w:t>
+            </w:r>
+          </w:p>
+        </w:tc>
+        <w:tc>
+          <w:tcPr>
+            <w:tcW w:type="dxa" w:w="2976"/>
+            <w:shd w:fill="F2F5F8" w:color="auto" w:val="clear"/>
+            <w:tcMar>
+              <w:top w:type="dxa" w:w="70"/>
+              <w:left w:type="dxa" w:w="110"/>
+              <w:bottom w:type="dxa" w:w="70"/>
+              <w:right w:type="dxa" w:w="110"/>
+            </w:tcMar>
+          </w:tcPr>
+          <w:p>
+            <w:pPr>
+              <w:spacing w:after="0" w:line="250"/>
+              <w:jc w:val="right"/>
+            </w:pPr>
+            <w:r>
+              <w:rPr>
+                <w:rFonts w:ascii="Calibri" w:cs="Calibri" w:eastAsia="Calibri" w:hAnsi="Calibri"/>
+                <w:sz w:val="19"/>
+                <w:szCs w:val="19"/>
+              </w:rPr>
+              <w:t xml:space="preserve">18,401, itemised</w:t>
+            </w:r>
+          </w:p>
+        </w:tc>
+      </w:tr>
+      <w:tr>
+        <w:tc>
+          <w:tcPr>
+            <w:tcW w:type="dxa" w:w="3067"/>
+            <w:tcMar>
+              <w:top w:type="dxa" w:w="70"/>
+              <w:left w:type="dxa" w:w="110"/>
+              <w:bottom w:type="dxa" w:w="70"/>
+              <w:right w:type="dxa" w:w="110"/>
+            </w:tcMar>
+          </w:tcPr>
+          <w:p>
+            <w:pPr>
+              <w:spacing w:after="0" w:line="250"/>
+            </w:pPr>
+            <w:r>
+              <w:rPr>
+                <w:rFonts w:ascii="Calibri" w:cs="Calibri" w:eastAsia="Calibri" w:hAnsi="Calibri"/>
+                <w:sz w:val="19"/>
+                <w:szCs w:val="19"/>
+              </w:rPr>
+              <w:t xml:space="preserve">Basket line items</w:t>
+            </w:r>
+          </w:p>
+        </w:tc>
+        <w:tc>
+          <w:tcPr>
+            <w:tcW w:type="dxa" w:w="2977"/>
+            <w:tcMar>
+              <w:top w:type="dxa" w:w="70"/>
+              <w:left w:type="dxa" w:w="110"/>
+              <w:bottom w:type="dxa" w:w="70"/>
+              <w:right w:type="dxa" w:w="110"/>
+            </w:tcMar>
+          </w:tcPr>
+          <w:p>
+            <w:pPr>
+              <w:spacing w:after="0" w:line="250"/>
+              <w:jc w:val="right"/>
+            </w:pPr>
+            <w:r>
+              <w:rPr>
+                <w:rFonts w:ascii="Calibri" w:cs="Calibri" w:eastAsia="Calibri" w:hAnsi="Calibri"/>
+                <w:sz w:val="19"/>
+                <w:szCs w:val="19"/>
+              </w:rPr>
+              <w:t xml:space="preserve">none</w:t>
+            </w:r>
+          </w:p>
+        </w:tc>
+        <w:tc>
+          <w:tcPr>
+            <w:tcW w:type="dxa" w:w="2976"/>
+            <w:tcMar>
+              <w:top w:type="dxa" w:w="70"/>
+              <w:left w:type="dxa" w:w="110"/>
+              <w:bottom w:type="dxa" w:w="70"/>
+              <w:right w:type="dxa" w:w="110"/>
+            </w:tcMar>
+          </w:tcPr>
+          <w:p>
+            <w:pPr>
+              <w:spacing w:after="0" w:line="250"/>
+              <w:jc w:val="right"/>
+            </w:pPr>
+            <w:r>
+              <w:rPr>
+                <w:rFonts w:ascii="Calibri" w:cs="Calibri" w:eastAsia="Calibri" w:hAnsi="Calibri"/>
+                <w:sz w:val="19"/>
+                <w:szCs w:val="19"/>
+              </w:rPr>
+              <w:t xml:space="preserve">29,054</w:t>
+            </w:r>
+          </w:p>
+        </w:tc>
+      </w:tr>
+      <w:tr>
+        <w:tc>
+          <w:tcPr>
+            <w:tcW w:type="dxa" w:w="3067"/>
+            <w:shd w:fill="F2F5F8" w:color="auto" w:val="clear"/>
+            <w:tcMar>
+              <w:top w:type="dxa" w:w="70"/>
+              <w:left w:type="dxa" w:w="110"/>
+              <w:bottom w:type="dxa" w:w="70"/>
+              <w:right w:type="dxa" w:w="110"/>
+            </w:tcMar>
+          </w:tcPr>
+          <w:p>
+            <w:pPr>
+              <w:spacing w:after="0" w:line="250"/>
+            </w:pPr>
+            <w:r>
+              <w:rPr>
+                <w:rFonts w:ascii="Calibri" w:cs="Calibri" w:eastAsia="Calibri" w:hAnsi="Calibri"/>
+                <w:sz w:val="19"/>
+                <w:szCs w:val="19"/>
+              </w:rPr>
+              <w:t xml:space="preserve">Cancellations</w:t>
+            </w:r>
+          </w:p>
+        </w:tc>
+        <w:tc>
+          <w:tcPr>
+            <w:tcW w:type="dxa" w:w="2977"/>
+            <w:shd w:fill="F2F5F8" w:color="auto" w:val="clear"/>
+            <w:tcMar>
+              <w:top w:type="dxa" w:w="70"/>
+              <w:left w:type="dxa" w:w="110"/>
+              <w:bottom w:type="dxa" w:w="70"/>
+              <w:right w:type="dxa" w:w="110"/>
+            </w:tcMar>
+          </w:tcPr>
+          <w:p>
+            <w:pPr>
+              <w:spacing w:after="0" w:line="250"/>
+              <w:jc w:val="right"/>
+            </w:pPr>
+            <w:r>
+              <w:rPr>
+                <w:rFonts w:ascii="Calibri" w:cs="Calibri" w:eastAsia="Calibri" w:hAnsi="Calibri"/>
+                <w:sz w:val="19"/>
+                <w:szCs w:val="19"/>
+              </w:rPr>
+              <w:t xml:space="preserve">412 aggregate rows</w:t>
+            </w:r>
+          </w:p>
+        </w:tc>
+        <w:tc>
+          <w:tcPr>
+            <w:tcW w:type="dxa" w:w="2976"/>
+            <w:shd w:fill="F2F5F8" w:color="auto" w:val="clear"/>
+            <w:tcMar>
+              <w:top w:type="dxa" w:w="70"/>
+              <w:left w:type="dxa" w:w="110"/>
+              <w:bottom w:type="dxa" w:w="70"/>
+              <w:right w:type="dxa" w:w="110"/>
+            </w:tcMar>
+          </w:tcPr>
+          <w:p>
+            <w:pPr>
+              <w:spacing w:after="0" w:line="250"/>
+              <w:jc w:val="right"/>
+            </w:pPr>
+            <w:r>
+              <w:rPr>
+                <w:rFonts w:ascii="Calibri" w:cs="Calibri" w:eastAsia="Calibri" w:hAnsi="Calibri"/>
+                <w:sz w:val="19"/>
+                <w:szCs w:val="19"/>
+              </w:rPr>
+              <w:t xml:space="preserve">5,411 dated rows</w:t>
+            </w:r>
+          </w:p>
+        </w:tc>
+      </w:tr>
+    </w:tbl>
+    <w:p>
+      <w:pPr>
+        <w:spacing w:after="140"/>
+      </w:pPr>
+      <w:r>
+        <w:t xml:space="preserve"/>
+      </w:r>
+    </w:p>
+    <w:p>
+      <w:pPr>
+        <w:pStyle w:val="Heading3"/>
+        <w:spacing w:after="100" w:before="200"/>
+      </w:pPr>
+      <w:r>
+        <w:rPr>
+          <w:rFonts w:ascii="Calibri" w:cs="Calibri" w:eastAsia="Calibri" w:hAnsi="Calibri"/>
+          <w:b/>
+          <w:bCs/>
+          <w:color w:val="2E2E2E"/>
+          <w:sz w:val="22"/>
+          <w:szCs w:val="22"/>
+        </w:rPr>
+        <w:t xml:space="preserve">Dimensions the export had nothing on</w:t>
+      </w:r>
+    </w:p>
+    <w:p>
+      <w:pPr>
+        <w:spacing w:after="140" w:line="276"/>
+      </w:pPr>
+      <w:r>
+        <w:rPr>
+          <w:rFonts w:ascii="Calibri" w:cs="Calibri" w:eastAsia="Calibri" w:hAnsi="Calibri"/>
+          <w:sz w:val="21"/>
+          <w:szCs w:val="21"/>
+        </w:rPr>
+        <w:t xml:space="preserve">Inventory snapshots (17,640), shelf sensor readings covering vision stockout, electronic labels and temperature probes (3,738), footfall and conversion per store hour (9,221), customers (480), suppliers (10) and employees (22). On top of those sit nine entities of scenario output, which are derived rather than synthesized.</w:t>
+      </w:r>
+    </w:p>
+    <w:p>
+      <w:pPr>
+        <w:pStyle w:val="Heading3"/>
+        <w:spacing w:after="100" w:before="200"/>
+      </w:pPr>
+      <w:r>
+        <w:rPr>
+          <w:rFonts w:ascii="Calibri" w:cs="Calibri" w:eastAsia="Calibri" w:hAnsi="Calibri"/>
+          <w:b/>
+          <w:bCs/>
+          <w:color w:val="2E2E2E"/>
+          <w:sz w:val="22"/>
+          <w:szCs w:val="22"/>
+        </w:rPr>
+        <w:t xml:space="preserve">The rule we held to</w:t>
+      </w:r>
+    </w:p>
+    <w:p>
+      <w:pPr>
+        <w:spacing w:after="140" w:line="276"/>
+      </w:pPr>
+      <w:r>
+        <w:rPr>
+          <w:rFonts w:ascii="Calibri" w:cs="Calibri" w:eastAsia="Calibri" w:hAnsi="Calibri"/>
+          <w:sz w:val="21"/>
+          <w:szCs w:val="21"/>
+        </w:rPr>
+        <w:t xml:space="preserve">Nothing was invented where a real distribution existed. The hour-of-day curve, the day-of-week factors, the article mix, the per-terminal cancellation rates and the payment split were all measured from the Walldorf export and replayed at other scales. Walldorf keeps its own figures untouched, and the provenance is carried in the data rather than in documentation - Stores.isReferenceStore and Articles.isFromSapExport - so any screen can state which numbers are real. The command centre does exactly that at the foot of the page.</w:t>
+      </w:r>
+    </w:p>
     <w:p>
       <w:r>
         <w:br w:type="page"/>

</xml_diff>